<commit_message>
docs: reconcile v2.2 completion milestones and evidence
</commit_message>
<xml_diff>
--- a/docs/specs/Germinatura_Especificacao_Funcional_Tecnica_v2.2.docx
+++ b/docs/specs/Germinatura_Especificacao_Funcional_Tecnica_v2.2.docx
@@ -1447,7 +1447,7 @@
         <w:br/>
         <w:t>├── Minha conta</w:t>
         <w:br/>
-        <w:t>├── Entrar com código institucional / Cadastro</w:t>
+        <w:t>├── Entrar com e-mail ou username e senha / Cadastro</w:t>
         <w:br/>
         <w:t>├── Abrir PDV (quando autorizado)</w:t>
         <w:br/>
@@ -2008,7 +2008,7 @@
         <w:pStyle w:val="ListBullet"/>
       </w:pPr>
       <w:r>
-        <w:t>Qualquer pessoa que comprove controle de um endereço no domínio exato @institutojef.org.br poderá autenticar-se no Portal por código de uso único enviado ao próprio e-mail; domínios externos, subdomínios e grafias semelhantes serão rejeitados.</w:t>
+        <w:t>Qualquer pessoa que comprove controle de um endereço no domínio exato @institutojef.org.br poderá cadastrar-se no Portal após verificar o endereço por código de uso único; o login cotidiano usa e-mail ou username e senha; domínios externos, subdomínios e grafias semelhantes serão rejeitados.</w:t>
       </w:r>
     </w:p>
     <w:p>
@@ -2016,7 +2016,7 @@
         <w:pStyle w:val="ListBullet"/>
       </w:pPr>
       <w:r>
-        <w:t>A primeira autenticação institucional válida concede somente o papel base CONSUMIDOR. A mesma identidade poderá acumular outros papéis, sem duplicação de conta.</w:t>
+        <w:t>O cadastro institucional verificado e concluído concede somente o papel base CONSUMIDOR. A mesma identidade poderá acumular outros papéis, sem duplicação de conta.</w:t>
       </w:r>
     </w:p>
     <w:p>
@@ -3153,7 +3153,7 @@
         <w:pStyle w:val="ListBullet"/>
       </w:pPr>
       <w:r>
-        <w:t>Entrada e cadastro por código de uso único enviado ao e-mail institucional @institutojef.org.br; o código deve expirar, ser de uso único e não pode ser registrado em logs.</w:t>
+        <w:t>Cadastro e recuperação verificam o e-mail institucional @institutojef.org.br por código de uso único, com expiração e proteção contra replay. O cadastro exige nome, username único e senha; login cotidiano no Portal e PDV usa e-mail ou username e senha, sem criação implícita de conta. Códigos nunca aparecem em logs.</w:t>
       </w:r>
     </w:p>
     <w:p>
@@ -6665,7 +6665,7 @@
               <w:rPr>
                 <w:sz w:val="17"/>
               </w:rPr>
-              <w:t>Registrar recebimento e, opcionalmente, valor entregue/troco. Requer política da comissão.</w:t>
+              <w:t>Registrar recebimento e, opcionalmente, valor entregue/troco. Aprovado pela comissão em 07/09/2026: caixa físico separado, recebimento/troco em centavos e conferência por turno, sem provider PicPay fictício.</w:t>
             </w:r>
           </w:p>
         </w:tc>
@@ -6882,7 +6882,7 @@
         <w:widowControl/>
       </w:pPr>
       <w:r>
-        <w:t>Nos fluxos PicPay Checkout/API, usar merchantChargeId único, webhook autenticado, consulta de status como fallback e idempotência interna. Pagamento online confirmado pelo PicPay conclui a venda automaticamente.</w:t>
+        <w:t>O primeiro canal online usa PicPay Payment Link, com identificadores de link/transação definidos no contrato oficial, webhook autenticado, consulta de status e idempotência interna. Não inferir merchantChargeId de outro produto Checkout. Confirmação válida consome estoque e gera venda/financeiro atomicamente; resultados tardios ou divergentes entram em conciliação.</w:t>
       </w:r>
     </w:p>
     <w:p>
@@ -11633,7 +11633,7 @@
         <w:pStyle w:val="ListBullet"/>
       </w:pPr>
       <w:r>
-        <w:t>payments/payment_attempts devem manter provider=PICPAY na configuração de produção e registrar integration_channel (PIX_AREA, CHECKOUT_API, PICPAY_WALLET, PAYMENT_LINK, MAQUININHA, TAP), external_id/merchantChargeId quando existir, referência interna, terminal interno quando aplicável, método efetivo, status, valor bruto, taxa conhecida, origem da confirmação (WEBHOOK, CONSULTA, MANUAL, IMPORTACAO_CONCILIACAO) e timestamps.</w:t>
+        <w:t>Pagamentos de adquirência externa mantêm provider=PICPAY e integration_channel conforme o produto homologado (PIX_AREA, PAYMENT_LINK, MAQUININHA e demais canais quando habilitados). Registrar método efetivo, identificador externo documentado, referência interna, terminal quando aplicável, valor bruto, taxa conhecida, origem da confirmação e timestamps. Dinheiro físico utiliza método e conta internos próprios, sem provider nem canal PicPay fictícios.</w:t>
       </w:r>
     </w:p>
     <w:p>
@@ -17495,6 +17495,65 @@
       </w:pPr>
       <w:r>
         <w:t>A arquitetura proposta evita microserviços e dependências excessivas. Dois frontends especializados compartilham um backend lógico e um PostgreSQL, com regras críticas executadas atomicamente. Na camada financeira, o PicPay Empresas é o único ecossistema de pagamentos da Germinatura: centraliza tesouraria e PIX, oferece Checkout/E-commerce para pagamentos online, Maquininha para cartão e V.A./V.R., Tap como opção restrita e extratos/recebíveis para conciliação. A escolha simplifica operação e atende à parceria estratégica, sem acoplar o domínio ao fornecedor: adapters e contratos continuam isolando regras de estoque, venda e financeiro. O resultado esperado é uma plataforma barata, rastreável e preparada para ganhar automação adicional caso o PicPay disponibilize integrações presenciais privadas ao projeto.</w:t>
+      </w:r>
+    </w:p>
+    <w:p>
+      <w:r>
+        <w:br w:type="page"/>
+      </w:r>
+    </w:p>
+    <w:p>
+      <w:pPr>
+        <w:pStyle w:val="Heading1"/>
+      </w:pPr>
+      <w:r>
+        <w:t>33 Atualização aprovada em setembro de 2026</w:t>
+      </w:r>
+    </w:p>
+    <w:p>
+      <w:r>
+        <w:t>Em 07/09/2026, o responsável pelo projeto aprovou a conclusão da v2.2 não opcional por marcos de aceite. Esta atualização prevalece sobre os recortes históricos de MVP e referências genéricas de Checkout deste documento. O detalhamento de execução e evidências está em docs/product/ROADMAP.md e REQUIREMENTS_MATRIX.md.</w:t>
+      </w:r>
+    </w:p>
+    <w:p>
+      <w:pPr>
+        <w:pStyle w:val="Heading2"/>
+      </w:pPr>
+      <w:r>
+        <w:t>Identidade e operação financeira</w:t>
+      </w:r>
+    </w:p>
+    <w:p>
+      <w:r>
+        <w:t>O ADR 0009 define cadastro institucional verificado seguido de nome, username e senha; login cotidiano por credenciais em Portal/PDV. Recuperação permite dois envios por ciclo, bloqueando novas solicitações até desbloqueio administrativo auditado. O bootstrap único exige o endereço administrativo verificado e não abre elevação permanente por e-mail.</w:t>
+      </w:r>
+    </w:p>
+    <w:p>
+      <w:r>
+        <w:t>O ADR 0010 adota PicPay Payment Link como canal online inicial. OAuth client_credentials é exclusivamente backend. O webhook usa a API Key no header authorization conforme documentação oficial; não presumir HMAC. Persistir receipt, deduplicar e reconciliar resultados incertos, duplicados ou tardios. Documentação pública disponível não comprova habilitação nem sandbox homologado. Nenhum adapter ou credencial é habilitado por esta atualização documental.</w:t>
+      </w:r>
+    </w:p>
+    <w:p>
+      <w:r>
+        <w:t>Dinheiro físico foi aprovado com método/conta próprios, recebimento, troco em centavos e fechamento por vendedor/turno. Não registrar dinheiro como adquirência PicPay. Reembolso solicitado é distinto de confirmado; reembolso parcial não cancela automaticamente toda a venda e a reposição exige itens devolvidos. Sorteios concluídos conservam sua evidência histórica.</w:t>
+      </w:r>
+    </w:p>
+    <w:p>
+      <w:pPr>
+        <w:pStyle w:val="Heading2"/>
+      </w:pPr>
+      <w:r>
+        <w:t>Conclusão por marcos</w:t>
+      </w:r>
+    </w:p>
+    <w:p>
+      <w:r>
+        <w:t>O congelamento de 10/09 e lançamento de 11/09 foram substituídos por aceite progressivo: reconciliação documental; catálogo; estoque; compras/custos; promoções; PDV/caixa; administração comercial/financeira; Payment Link; compra/reservas/rifas; gestão/indicadores; campanhas/comunidade; homologação/release. Cada marco exige comportamento, testes e evidência por ambiente, sem confundir backend com jornada completa.</w:t>
+      </w:r>
+    </w:p>
+    <w:p>
+      <w:r>
+        <w:t>Campanhas, mural moderado e notificações in-app integram este lançamento. App nativo, chat privado, cards automáticos, Web Push, SFTP, Open Finance e integração remota de terminal continuam condicionais. Tap e V.A./V.R. exigem habilitação própria. Promoção develop para main depende de autorização explícita após CI e revisão; nenhum reset ou seed destrutivo é permitido em produção.</w:t>
       </w:r>
     </w:p>
     <w:sectPr>

</xml_diff>

<commit_message>
docs: reconcile v2.2 completion milestones and evidence (#52)
</commit_message>
<xml_diff>
--- a/docs/specs/Germinatura_Especificacao_Funcional_Tecnica_v2.2.docx
+++ b/docs/specs/Germinatura_Especificacao_Funcional_Tecnica_v2.2.docx
@@ -1447,7 +1447,7 @@
         <w:br/>
         <w:t>├── Minha conta</w:t>
         <w:br/>
-        <w:t>├── Entrar com código institucional / Cadastro</w:t>
+        <w:t>├── Entrar com e-mail ou username e senha / Cadastro</w:t>
         <w:br/>
         <w:t>├── Abrir PDV (quando autorizado)</w:t>
         <w:br/>
@@ -2008,7 +2008,7 @@
         <w:pStyle w:val="ListBullet"/>
       </w:pPr>
       <w:r>
-        <w:t>Qualquer pessoa que comprove controle de um endereço no domínio exato @institutojef.org.br poderá autenticar-se no Portal por código de uso único enviado ao próprio e-mail; domínios externos, subdomínios e grafias semelhantes serão rejeitados.</w:t>
+        <w:t>Qualquer pessoa que comprove controle de um endereço no domínio exato @institutojef.org.br poderá cadastrar-se no Portal após verificar o endereço por código de uso único; o login cotidiano usa e-mail ou username e senha; domínios externos, subdomínios e grafias semelhantes serão rejeitados.</w:t>
       </w:r>
     </w:p>
     <w:p>
@@ -2016,7 +2016,7 @@
         <w:pStyle w:val="ListBullet"/>
       </w:pPr>
       <w:r>
-        <w:t>A primeira autenticação institucional válida concede somente o papel base CONSUMIDOR. A mesma identidade poderá acumular outros papéis, sem duplicação de conta.</w:t>
+        <w:t>O cadastro institucional verificado e concluído concede somente o papel base CONSUMIDOR. A mesma identidade poderá acumular outros papéis, sem duplicação de conta.</w:t>
       </w:r>
     </w:p>
     <w:p>
@@ -3153,7 +3153,7 @@
         <w:pStyle w:val="ListBullet"/>
       </w:pPr>
       <w:r>
-        <w:t>Entrada e cadastro por código de uso único enviado ao e-mail institucional @institutojef.org.br; o código deve expirar, ser de uso único e não pode ser registrado em logs.</w:t>
+        <w:t>Cadastro e recuperação verificam o e-mail institucional @institutojef.org.br por código de uso único, com expiração e proteção contra replay. O cadastro exige nome, username único e senha; login cotidiano no Portal e PDV usa e-mail ou username e senha, sem criação implícita de conta. Códigos nunca aparecem em logs.</w:t>
       </w:r>
     </w:p>
     <w:p>
@@ -6665,7 +6665,7 @@
               <w:rPr>
                 <w:sz w:val="17"/>
               </w:rPr>
-              <w:t>Registrar recebimento e, opcionalmente, valor entregue/troco. Requer política da comissão.</w:t>
+              <w:t>Registrar recebimento e, opcionalmente, valor entregue/troco. Aprovado pela comissão em 07/09/2026: caixa físico separado, recebimento/troco em centavos e conferência por turno, sem provider PicPay fictício.</w:t>
             </w:r>
           </w:p>
         </w:tc>
@@ -6882,7 +6882,7 @@
         <w:widowControl/>
       </w:pPr>
       <w:r>
-        <w:t>Nos fluxos PicPay Checkout/API, usar merchantChargeId único, webhook autenticado, consulta de status como fallback e idempotência interna. Pagamento online confirmado pelo PicPay conclui a venda automaticamente.</w:t>
+        <w:t>O primeiro canal online usa PicPay Payment Link, com identificadores de link/transação definidos no contrato oficial, webhook autenticado, consulta de status e idempotência interna. Não inferir merchantChargeId de outro produto Checkout. Confirmação válida consome estoque e gera venda/financeiro atomicamente; resultados tardios ou divergentes entram em conciliação.</w:t>
       </w:r>
     </w:p>
     <w:p>
@@ -11633,7 +11633,7 @@
         <w:pStyle w:val="ListBullet"/>
       </w:pPr>
       <w:r>
-        <w:t>payments/payment_attempts devem manter provider=PICPAY na configuração de produção e registrar integration_channel (PIX_AREA, CHECKOUT_API, PICPAY_WALLET, PAYMENT_LINK, MAQUININHA, TAP), external_id/merchantChargeId quando existir, referência interna, terminal interno quando aplicável, método efetivo, status, valor bruto, taxa conhecida, origem da confirmação (WEBHOOK, CONSULTA, MANUAL, IMPORTACAO_CONCILIACAO) e timestamps.</w:t>
+        <w:t>Pagamentos de adquirência externa mantêm provider=PICPAY e integration_channel conforme o produto homologado (PIX_AREA, PAYMENT_LINK, MAQUININHA e demais canais quando habilitados). Registrar método efetivo, identificador externo documentado, referência interna, terminal quando aplicável, valor bruto, taxa conhecida, origem da confirmação e timestamps. Dinheiro físico utiliza método e conta internos próprios, sem provider nem canal PicPay fictícios.</w:t>
       </w:r>
     </w:p>
     <w:p>
@@ -17495,6 +17495,65 @@
       </w:pPr>
       <w:r>
         <w:t>A arquitetura proposta evita microserviços e dependências excessivas. Dois frontends especializados compartilham um backend lógico e um PostgreSQL, com regras críticas executadas atomicamente. Na camada financeira, o PicPay Empresas é o único ecossistema de pagamentos da Germinatura: centraliza tesouraria e PIX, oferece Checkout/E-commerce para pagamentos online, Maquininha para cartão e V.A./V.R., Tap como opção restrita e extratos/recebíveis para conciliação. A escolha simplifica operação e atende à parceria estratégica, sem acoplar o domínio ao fornecedor: adapters e contratos continuam isolando regras de estoque, venda e financeiro. O resultado esperado é uma plataforma barata, rastreável e preparada para ganhar automação adicional caso o PicPay disponibilize integrações presenciais privadas ao projeto.</w:t>
+      </w:r>
+    </w:p>
+    <w:p>
+      <w:r>
+        <w:br w:type="page"/>
+      </w:r>
+    </w:p>
+    <w:p>
+      <w:pPr>
+        <w:pStyle w:val="Heading1"/>
+      </w:pPr>
+      <w:r>
+        <w:t>33 Atualização aprovada em setembro de 2026</w:t>
+      </w:r>
+    </w:p>
+    <w:p>
+      <w:r>
+        <w:t>Em 07/09/2026, o responsável pelo projeto aprovou a conclusão da v2.2 não opcional por marcos de aceite. Esta atualização prevalece sobre os recortes históricos de MVP e referências genéricas de Checkout deste documento. O detalhamento de execução e evidências está em docs/product/ROADMAP.md e REQUIREMENTS_MATRIX.md.</w:t>
+      </w:r>
+    </w:p>
+    <w:p>
+      <w:pPr>
+        <w:pStyle w:val="Heading2"/>
+      </w:pPr>
+      <w:r>
+        <w:t>Identidade e operação financeira</w:t>
+      </w:r>
+    </w:p>
+    <w:p>
+      <w:r>
+        <w:t>O ADR 0009 define cadastro institucional verificado seguido de nome, username e senha; login cotidiano por credenciais em Portal/PDV. Recuperação permite dois envios por ciclo, bloqueando novas solicitações até desbloqueio administrativo auditado. O bootstrap único exige o endereço administrativo verificado e não abre elevação permanente por e-mail.</w:t>
+      </w:r>
+    </w:p>
+    <w:p>
+      <w:r>
+        <w:t>O ADR 0010 adota PicPay Payment Link como canal online inicial. OAuth client_credentials é exclusivamente backend. O webhook usa a API Key no header authorization conforme documentação oficial; não presumir HMAC. Persistir receipt, deduplicar e reconciliar resultados incertos, duplicados ou tardios. Documentação pública disponível não comprova habilitação nem sandbox homologado. Nenhum adapter ou credencial é habilitado por esta atualização documental.</w:t>
+      </w:r>
+    </w:p>
+    <w:p>
+      <w:r>
+        <w:t>Dinheiro físico foi aprovado com método/conta próprios, recebimento, troco em centavos e fechamento por vendedor/turno. Não registrar dinheiro como adquirência PicPay. Reembolso solicitado é distinto de confirmado; reembolso parcial não cancela automaticamente toda a venda e a reposição exige itens devolvidos. Sorteios concluídos conservam sua evidência histórica.</w:t>
+      </w:r>
+    </w:p>
+    <w:p>
+      <w:pPr>
+        <w:pStyle w:val="Heading2"/>
+      </w:pPr>
+      <w:r>
+        <w:t>Conclusão por marcos</w:t>
+      </w:r>
+    </w:p>
+    <w:p>
+      <w:r>
+        <w:t>O congelamento de 10/09 e lançamento de 11/09 foram substituídos por aceite progressivo: reconciliação documental; catálogo; estoque; compras/custos; promoções; PDV/caixa; administração comercial/financeira; Payment Link; compra/reservas/rifas; gestão/indicadores; campanhas/comunidade; homologação/release. Cada marco exige comportamento, testes e evidência por ambiente, sem confundir backend com jornada completa.</w:t>
+      </w:r>
+    </w:p>
+    <w:p>
+      <w:r>
+        <w:t>Campanhas, mural moderado e notificações in-app integram este lançamento. App nativo, chat privado, cards automáticos, Web Push, SFTP, Open Finance e integração remota de terminal continuam condicionais. Tap e V.A./V.R. exigem habilitação própria. Promoção develop para main depende de autorização explícita após CI e revisão; nenhum reset ou seed destrutivo é permitido em produção.</w:t>
       </w:r>
     </w:p>
     <w:sectPr>

</xml_diff>

<commit_message>
release: promote Marco 1 to production (#159)
Co-authored-by: Claude Opus 5.5 <noreply@anthropic.com>
</commit_message>
<xml_diff>
--- a/docs/specs/Germinatura_Especificacao_Funcional_Tecnica_v2.2.docx
+++ b/docs/specs/Germinatura_Especificacao_Funcional_Tecnica_v2.2.docx
@@ -1447,7 +1447,7 @@
         <w:br/>
         <w:t>├── Minha conta</w:t>
         <w:br/>
-        <w:t>├── Entrar com código institucional / Cadastro</w:t>
+        <w:t>├── Entrar com e-mail ou username e senha / Cadastro</w:t>
         <w:br/>
         <w:t>├── Abrir PDV (quando autorizado)</w:t>
         <w:br/>
@@ -2008,7 +2008,7 @@
         <w:pStyle w:val="ListBullet"/>
       </w:pPr>
       <w:r>
-        <w:t>Qualquer pessoa que comprove controle de um endereço no domínio exato @institutojef.org.br poderá autenticar-se no Portal por código de uso único enviado ao próprio e-mail; domínios externos, subdomínios e grafias semelhantes serão rejeitados.</w:t>
+        <w:t>Qualquer pessoa que comprove controle de um endereço no domínio exato @institutojef.org.br poderá cadastrar-se no Portal após verificar o endereço por código de uso único; o login cotidiano usa e-mail ou username e senha; domínios externos, subdomínios e grafias semelhantes serão rejeitados.</w:t>
       </w:r>
     </w:p>
     <w:p>
@@ -2016,7 +2016,7 @@
         <w:pStyle w:val="ListBullet"/>
       </w:pPr>
       <w:r>
-        <w:t>A primeira autenticação institucional válida concede somente o papel base CONSUMIDOR. A mesma identidade poderá acumular outros papéis, sem duplicação de conta.</w:t>
+        <w:t>O cadastro institucional verificado e concluído concede somente o papel base CONSUMIDOR. A mesma identidade poderá acumular outros papéis, sem duplicação de conta.</w:t>
       </w:r>
     </w:p>
     <w:p>
@@ -3153,7 +3153,7 @@
         <w:pStyle w:val="ListBullet"/>
       </w:pPr>
       <w:r>
-        <w:t>Entrada e cadastro por código de uso único enviado ao e-mail institucional @institutojef.org.br; o código deve expirar, ser de uso único e não pode ser registrado em logs.</w:t>
+        <w:t>Cadastro e recuperação verificam o e-mail institucional @institutojef.org.br por código de uso único, com expiração e proteção contra replay. O cadastro exige nome, username único e senha; login cotidiano no Portal e PDV usa e-mail ou username e senha, sem criação implícita de conta. Códigos nunca aparecem em logs.</w:t>
       </w:r>
     </w:p>
     <w:p>
@@ -6665,7 +6665,7 @@
               <w:rPr>
                 <w:sz w:val="17"/>
               </w:rPr>
-              <w:t>Registrar recebimento e, opcionalmente, valor entregue/troco. Requer política da comissão.</w:t>
+              <w:t>Registrar recebimento e, opcionalmente, valor entregue/troco. Aprovado pela comissão em 07/09/2026: caixa físico separado, recebimento/troco em centavos e conferência por turno, sem provider PicPay fictício.</w:t>
             </w:r>
           </w:p>
         </w:tc>
@@ -6882,7 +6882,7 @@
         <w:widowControl/>
       </w:pPr>
       <w:r>
-        <w:t>Nos fluxos PicPay Checkout/API, usar merchantChargeId único, webhook autenticado, consulta de status como fallback e idempotência interna. Pagamento online confirmado pelo PicPay conclui a venda automaticamente.</w:t>
+        <w:t>O primeiro canal online usa PicPay Payment Link, com identificadores de link/transação definidos no contrato oficial, webhook autenticado, consulta de status e idempotência interna. Não inferir merchantChargeId de outro produto Checkout. Confirmação válida consome estoque e gera venda/financeiro atomicamente; resultados tardios ou divergentes entram em conciliação.</w:t>
       </w:r>
     </w:p>
     <w:p>
@@ -11633,7 +11633,7 @@
         <w:pStyle w:val="ListBullet"/>
       </w:pPr>
       <w:r>
-        <w:t>payments/payment_attempts devem manter provider=PICPAY na configuração de produção e registrar integration_channel (PIX_AREA, CHECKOUT_API, PICPAY_WALLET, PAYMENT_LINK, MAQUININHA, TAP), external_id/merchantChargeId quando existir, referência interna, terminal interno quando aplicável, método efetivo, status, valor bruto, taxa conhecida, origem da confirmação (WEBHOOK, CONSULTA, MANUAL, IMPORTACAO_CONCILIACAO) e timestamps.</w:t>
+        <w:t>Pagamentos de adquirência externa mantêm provider=PICPAY e integration_channel conforme o produto homologado (PIX_AREA, PAYMENT_LINK, MAQUININHA e demais canais quando habilitados). Registrar método efetivo, identificador externo documentado, referência interna, terminal quando aplicável, valor bruto, taxa conhecida, origem da confirmação e timestamps. Dinheiro físico utiliza método e conta internos próprios, sem provider nem canal PicPay fictícios.</w:t>
       </w:r>
     </w:p>
     <w:p>
@@ -17495,6 +17495,65 @@
       </w:pPr>
       <w:r>
         <w:t>A arquitetura proposta evita microserviços e dependências excessivas. Dois frontends especializados compartilham um backend lógico e um PostgreSQL, com regras críticas executadas atomicamente. Na camada financeira, o PicPay Empresas é o único ecossistema de pagamentos da Germinatura: centraliza tesouraria e PIX, oferece Checkout/E-commerce para pagamentos online, Maquininha para cartão e V.A./V.R., Tap como opção restrita e extratos/recebíveis para conciliação. A escolha simplifica operação e atende à parceria estratégica, sem acoplar o domínio ao fornecedor: adapters e contratos continuam isolando regras de estoque, venda e financeiro. O resultado esperado é uma plataforma barata, rastreável e preparada para ganhar automação adicional caso o PicPay disponibilize integrações presenciais privadas ao projeto.</w:t>
+      </w:r>
+    </w:p>
+    <w:p>
+      <w:r>
+        <w:br w:type="page"/>
+      </w:r>
+    </w:p>
+    <w:p>
+      <w:pPr>
+        <w:pStyle w:val="Heading1"/>
+      </w:pPr>
+      <w:r>
+        <w:t>33 Atualização aprovada em setembro de 2026</w:t>
+      </w:r>
+    </w:p>
+    <w:p>
+      <w:r>
+        <w:t>Em 07/09/2026, o responsável pelo projeto aprovou a conclusão da v2.2 não opcional por marcos de aceite. Esta atualização prevalece sobre os recortes históricos de MVP e referências genéricas de Checkout deste documento. O detalhamento de execução e evidências está em docs/product/ROADMAP.md e REQUIREMENTS_MATRIX.md.</w:t>
+      </w:r>
+    </w:p>
+    <w:p>
+      <w:pPr>
+        <w:pStyle w:val="Heading2"/>
+      </w:pPr>
+      <w:r>
+        <w:t>Identidade e operação financeira</w:t>
+      </w:r>
+    </w:p>
+    <w:p>
+      <w:r>
+        <w:t>O ADR 0009 define cadastro institucional verificado seguido de nome, username e senha; login cotidiano por credenciais em Portal/PDV. Recuperação permite dois envios por ciclo, bloqueando novas solicitações até desbloqueio administrativo auditado. O bootstrap único exige o endereço administrativo verificado e não abre elevação permanente por e-mail.</w:t>
+      </w:r>
+    </w:p>
+    <w:p>
+      <w:r>
+        <w:t>O ADR 0010 adota PicPay Payment Link como canal online inicial. OAuth client_credentials é exclusivamente backend. O webhook usa a API Key no header authorization conforme documentação oficial; não presumir HMAC. Persistir receipt, deduplicar e reconciliar resultados incertos, duplicados ou tardios. Documentação pública disponível não comprova habilitação nem sandbox homologado. Nenhum adapter ou credencial é habilitado por esta atualização documental.</w:t>
+      </w:r>
+    </w:p>
+    <w:p>
+      <w:r>
+        <w:t>Dinheiro físico foi aprovado com método/conta próprios, recebimento, troco em centavos e fechamento por vendedor/turno. Não registrar dinheiro como adquirência PicPay. Reembolso solicitado é distinto de confirmado; reembolso parcial não cancela automaticamente toda a venda e a reposição exige itens devolvidos. Sorteios concluídos conservam sua evidência histórica.</w:t>
+      </w:r>
+    </w:p>
+    <w:p>
+      <w:pPr>
+        <w:pStyle w:val="Heading2"/>
+      </w:pPr>
+      <w:r>
+        <w:t>Conclusão por marcos</w:t>
+      </w:r>
+    </w:p>
+    <w:p>
+      <w:r>
+        <w:t>O congelamento de 10/09 e lançamento de 11/09 foram substituídos por aceite progressivo: reconciliação documental; catálogo; estoque; compras/custos; promoções; PDV/caixa; administração comercial/financeira; Payment Link; compra/reservas/rifas; gestão/indicadores; campanhas/comunidade; homologação/release. Cada marco exige comportamento, testes e evidência por ambiente, sem confundir backend com jornada completa.</w:t>
+      </w:r>
+    </w:p>
+    <w:p>
+      <w:r>
+        <w:t>Campanhas, mural moderado e notificações in-app integram este lançamento. App nativo, chat privado, cards automáticos, Web Push, SFTP, Open Finance e integração remota de terminal continuam condicionais. Tap e V.A./V.R. exigem habilitação própria. Promoção develop para main depende de autorização explícita após CI e revisão; nenhum reset ou seed destrutivo é permitido em produção.</w:t>
       </w:r>
     </w:p>
     <w:sectPr>

</xml_diff>